<commit_message>
Le pdf fonctionne maintenant avec la base de donnée
</commit_message>
<xml_diff>
--- a/Document/Project2-Mandat1 (1).docx
+++ b/Document/Project2-Mandat1 (1).docx
@@ -123,6 +123,7 @@
           <w:lang w:val="en-CA"/>
         </w:rPr>
       </w:pPr>
+      <w:proofErr w:type="gramStart"/>
       <w:r>
         <w:rPr>
           <w:rFonts w:ascii="Times New Roman" w:hAnsi="Times New Roman" w:cs="Times New Roman"/>
@@ -132,6 +133,7 @@
         </w:rPr>
         <w:t>Par :</w:t>
       </w:r>
+      <w:proofErr w:type="gramEnd"/>
     </w:p>
     <w:p>
       <w:pPr>
@@ -371,7 +373,21 @@
         <w:rPr>
           <w:rFonts w:ascii="Times New Roman" w:hAnsi="Times New Roman" w:cs="Times New Roman"/>
         </w:rPr>
-        <w:t xml:space="preserve">qui permet de géré les rôle employers et </w:t>
+        <w:t xml:space="preserve">qui permet de </w:t>
+      </w:r>
+      <w:proofErr w:type="gramStart"/>
+      <w:r>
+        <w:rPr>
+          <w:rFonts w:ascii="Times New Roman" w:hAnsi="Times New Roman" w:cs="Times New Roman"/>
+        </w:rPr>
+        <w:t>géré</w:t>
+      </w:r>
+      <w:proofErr w:type="gramEnd"/>
+      <w:r>
+        <w:rPr>
+          <w:rFonts w:ascii="Times New Roman" w:hAnsi="Times New Roman" w:cs="Times New Roman"/>
+        </w:rPr>
+        <w:t xml:space="preserve"> les rôle employers et </w:t>
       </w:r>
       <w:r>
         <w:rPr>
@@ -570,11 +586,19 @@
         </w:rPr>
         <w:t xml:space="preserve">peut </w:t>
       </w:r>
-      <w:r>
-        <w:rPr>
-          <w:rFonts w:ascii="Times New Roman" w:hAnsi="Times New Roman" w:cs="Times New Roman"/>
-        </w:rPr>
-        <w:t xml:space="preserve">géré </w:t>
+      <w:proofErr w:type="gramStart"/>
+      <w:r>
+        <w:rPr>
+          <w:rFonts w:ascii="Times New Roman" w:hAnsi="Times New Roman" w:cs="Times New Roman"/>
+        </w:rPr>
+        <w:t>géré</w:t>
+      </w:r>
+      <w:proofErr w:type="gramEnd"/>
+      <w:r>
+        <w:rPr>
+          <w:rFonts w:ascii="Times New Roman" w:hAnsi="Times New Roman" w:cs="Times New Roman"/>
+        </w:rPr>
+        <w:t xml:space="preserve"> </w:t>
       </w:r>
       <w:r>
         <w:rPr>
@@ -613,7 +637,23 @@
           <w:rFonts w:ascii="Times New Roman" w:hAnsi="Times New Roman" w:cs="Times New Roman"/>
           <w:lang w:eastAsia="zh-TW"/>
         </w:rPr>
-        <w:t>Gestionnaire peut géré les voitures</w:t>
+        <w:t xml:space="preserve">Gestionnaire peut </w:t>
+      </w:r>
+      <w:proofErr w:type="gramStart"/>
+      <w:r>
+        <w:rPr>
+          <w:rFonts w:ascii="Times New Roman" w:hAnsi="Times New Roman" w:cs="Times New Roman"/>
+          <w:lang w:eastAsia="zh-TW"/>
+        </w:rPr>
+        <w:t>géré</w:t>
+      </w:r>
+      <w:proofErr w:type="gramEnd"/>
+      <w:r>
+        <w:rPr>
+          <w:rFonts w:ascii="Times New Roman" w:hAnsi="Times New Roman" w:cs="Times New Roman"/>
+          <w:lang w:eastAsia="zh-TW"/>
+        </w:rPr>
+        <w:t xml:space="preserve"> les voitures</w:t>
       </w:r>
       <w:r>
         <w:rPr>
@@ -729,7 +769,7 @@
     </w:p>
     <w:p>
       <w:pPr>
-        <w:pStyle w:val="a9"/>
+        <w:pStyle w:val="Paragraphedeliste"/>
         <w:numPr>
           <w:ilvl w:val="0"/>
           <w:numId w:val="1"/>
@@ -753,7 +793,7 @@
     </w:p>
     <w:p>
       <w:pPr>
-        <w:pStyle w:val="a9"/>
+        <w:pStyle w:val="Paragraphedeliste"/>
         <w:numPr>
           <w:ilvl w:val="0"/>
           <w:numId w:val="1"/>
@@ -796,7 +836,7 @@
     </w:p>
     <w:p>
       <w:pPr>
-        <w:pStyle w:val="a9"/>
+        <w:pStyle w:val="Paragraphedeliste"/>
         <w:numPr>
           <w:ilvl w:val="0"/>
           <w:numId w:val="1"/>
@@ -827,7 +867,7 @@
     </w:p>
     <w:p>
       <w:pPr>
-        <w:pStyle w:val="a9"/>
+        <w:pStyle w:val="Paragraphedeliste"/>
         <w:numPr>
           <w:ilvl w:val="0"/>
           <w:numId w:val="1"/>
@@ -845,7 +885,7 @@
     </w:p>
     <w:p>
       <w:pPr>
-        <w:pStyle w:val="a9"/>
+        <w:pStyle w:val="Paragraphedeliste"/>
         <w:numPr>
           <w:ilvl w:val="0"/>
           <w:numId w:val="1"/>
@@ -882,7 +922,7 @@
     </w:p>
     <w:p>
       <w:pPr>
-        <w:pStyle w:val="a9"/>
+        <w:pStyle w:val="Paragraphedeliste"/>
         <w:numPr>
           <w:ilvl w:val="0"/>
           <w:numId w:val="1"/>
@@ -1008,7 +1048,7 @@
     </w:p>
     <w:tbl>
       <w:tblPr>
-        <w:tblStyle w:val="ae"/>
+        <w:tblStyle w:val="Grilledutableau"/>
         <w:tblW w:w="0" w:type="auto"/>
         <w:tblLook w:val="04A0" w:firstRow="1" w:lastRow="0" w:firstColumn="1" w:lastColumn="0" w:noHBand="0" w:noVBand="1"/>
       </w:tblPr>
@@ -1065,11 +1105,19 @@
                 <w:rFonts w:ascii="Times New Roman" w:hAnsi="Times New Roman" w:cs="Times New Roman"/>
               </w:rPr>
             </w:pPr>
-            <w:r>
-              <w:rPr>
-                <w:rFonts w:ascii="Times New Roman" w:hAnsi="Times New Roman" w:cs="Times New Roman"/>
-              </w:rPr>
-              <w:t>id_client</w:t>
+            <w:proofErr w:type="gramStart"/>
+            <w:r>
+              <w:rPr>
+                <w:rFonts w:ascii="Times New Roman" w:hAnsi="Times New Roman" w:cs="Times New Roman"/>
+              </w:rPr>
+              <w:t>id</w:t>
+            </w:r>
+            <w:proofErr w:type="gramEnd"/>
+            <w:r>
+              <w:rPr>
+                <w:rFonts w:ascii="Times New Roman" w:hAnsi="Times New Roman" w:cs="Times New Roman"/>
+              </w:rPr>
+              <w:t>_client</w:t>
             </w:r>
           </w:p>
         </w:tc>
@@ -1103,11 +1151,19 @@
                 <w:rFonts w:ascii="Times New Roman" w:hAnsi="Times New Roman" w:cs="Times New Roman"/>
               </w:rPr>
             </w:pPr>
-            <w:r>
-              <w:rPr>
-                <w:rFonts w:ascii="Times New Roman" w:hAnsi="Times New Roman" w:cs="Times New Roman"/>
-              </w:rPr>
-              <w:t>id_voiture</w:t>
+            <w:proofErr w:type="gramStart"/>
+            <w:r>
+              <w:rPr>
+                <w:rFonts w:ascii="Times New Roman" w:hAnsi="Times New Roman" w:cs="Times New Roman"/>
+              </w:rPr>
+              <w:t>id</w:t>
+            </w:r>
+            <w:proofErr w:type="gramEnd"/>
+            <w:r>
+              <w:rPr>
+                <w:rFonts w:ascii="Times New Roman" w:hAnsi="Times New Roman" w:cs="Times New Roman"/>
+              </w:rPr>
+              <w:t>_voiture</w:t>
             </w:r>
           </w:p>
         </w:tc>
@@ -1151,8 +1207,16 @@
               <w:rPr>
                 <w:rFonts w:ascii="Times New Roman" w:hAnsi="Times New Roman" w:cs="Times New Roman"/>
               </w:rPr>
-              <w:t xml:space="preserve"> employe</w:t>
-            </w:r>
+              <w:t xml:space="preserve"> </w:t>
+            </w:r>
+            <w:proofErr w:type="gramStart"/>
+            <w:r>
+              <w:rPr>
+                <w:rFonts w:ascii="Times New Roman" w:hAnsi="Times New Roman" w:cs="Times New Roman"/>
+              </w:rPr>
+              <w:t>employe</w:t>
+            </w:r>
+            <w:proofErr w:type="gramEnd"/>
           </w:p>
         </w:tc>
         <w:tc>
@@ -1185,11 +1249,19 @@
                 <w:rFonts w:ascii="Times New Roman" w:hAnsi="Times New Roman" w:cs="Times New Roman"/>
               </w:rPr>
             </w:pPr>
-            <w:r>
-              <w:rPr>
-                <w:rFonts w:ascii="Times New Roman" w:hAnsi="Times New Roman" w:cs="Times New Roman"/>
-              </w:rPr>
-              <w:t>date_fin_garantie</w:t>
+            <w:proofErr w:type="gramStart"/>
+            <w:r>
+              <w:rPr>
+                <w:rFonts w:ascii="Times New Roman" w:hAnsi="Times New Roman" w:cs="Times New Roman"/>
+              </w:rPr>
+              <w:t>date</w:t>
+            </w:r>
+            <w:proofErr w:type="gramEnd"/>
+            <w:r>
+              <w:rPr>
+                <w:rFonts w:ascii="Times New Roman" w:hAnsi="Times New Roman" w:cs="Times New Roman"/>
+              </w:rPr>
+              <w:t>_fin_garantie</w:t>
             </w:r>
           </w:p>
         </w:tc>
@@ -1223,11 +1295,19 @@
                 <w:rFonts w:ascii="Times New Roman" w:hAnsi="Times New Roman" w:cs="Times New Roman"/>
               </w:rPr>
             </w:pPr>
-            <w:r>
-              <w:rPr>
-                <w:rFonts w:ascii="Times New Roman" w:hAnsi="Times New Roman" w:cs="Times New Roman"/>
-              </w:rPr>
-              <w:t>prix_vente</w:t>
+            <w:proofErr w:type="gramStart"/>
+            <w:r>
+              <w:rPr>
+                <w:rFonts w:ascii="Times New Roman" w:hAnsi="Times New Roman" w:cs="Times New Roman"/>
+              </w:rPr>
+              <w:t>prix</w:t>
+            </w:r>
+            <w:proofErr w:type="gramEnd"/>
+            <w:r>
+              <w:rPr>
+                <w:rFonts w:ascii="Times New Roman" w:hAnsi="Times New Roman" w:cs="Times New Roman"/>
+              </w:rPr>
+              <w:t>_vente</w:t>
             </w:r>
           </w:p>
         </w:tc>
@@ -1267,11 +1347,19 @@
                 <w:rFonts w:ascii="Times New Roman" w:hAnsi="Times New Roman" w:cs="Times New Roman"/>
               </w:rPr>
             </w:pPr>
-            <w:r>
-              <w:rPr>
-                <w:rFonts w:ascii="Times New Roman" w:hAnsi="Times New Roman" w:cs="Times New Roman"/>
-              </w:rPr>
-              <w:t>date_création</w:t>
+            <w:proofErr w:type="gramStart"/>
+            <w:r>
+              <w:rPr>
+                <w:rFonts w:ascii="Times New Roman" w:hAnsi="Times New Roman" w:cs="Times New Roman"/>
+              </w:rPr>
+              <w:t>date</w:t>
+            </w:r>
+            <w:proofErr w:type="gramEnd"/>
+            <w:r>
+              <w:rPr>
+                <w:rFonts w:ascii="Times New Roman" w:hAnsi="Times New Roman" w:cs="Times New Roman"/>
+              </w:rPr>
+              <w:t>_création</w:t>
             </w:r>
           </w:p>
         </w:tc>
@@ -1320,7 +1408,7 @@
     </w:p>
     <w:tbl>
       <w:tblPr>
-        <w:tblStyle w:val="ae"/>
+        <w:tblStyle w:val="Grilledutableau"/>
         <w:tblW w:w="0" w:type="auto"/>
         <w:tblLook w:val="04A0" w:firstRow="1" w:lastRow="0" w:firstColumn="1" w:lastColumn="0" w:noHBand="0" w:noVBand="1"/>
       </w:tblPr>
@@ -1479,6 +1567,7 @@
                 <w:rFonts w:ascii="Times New Roman" w:hAnsi="Times New Roman" w:cs="Times New Roman"/>
               </w:rPr>
             </w:pPr>
+            <w:proofErr w:type="gramStart"/>
             <w:r>
               <w:rPr>
                 <w:rFonts w:ascii="Times New Roman" w:hAnsi="Times New Roman" w:cs="Times New Roman"/>
@@ -1491,6 +1580,7 @@
               </w:rPr>
               <w:t>hone</w:t>
             </w:r>
+            <w:proofErr w:type="gramEnd"/>
           </w:p>
         </w:tc>
         <w:tc>
@@ -1523,11 +1613,19 @@
                 <w:rFonts w:ascii="Times New Roman" w:hAnsi="Times New Roman" w:cs="Times New Roman"/>
               </w:rPr>
             </w:pPr>
-            <w:r>
-              <w:rPr>
-                <w:rFonts w:ascii="Times New Roman" w:hAnsi="Times New Roman" w:cs="Times New Roman"/>
-              </w:rPr>
-              <w:t>date_création</w:t>
+            <w:proofErr w:type="gramStart"/>
+            <w:r>
+              <w:rPr>
+                <w:rFonts w:ascii="Times New Roman" w:hAnsi="Times New Roman" w:cs="Times New Roman"/>
+              </w:rPr>
+              <w:t>date</w:t>
+            </w:r>
+            <w:proofErr w:type="gramEnd"/>
+            <w:r>
+              <w:rPr>
+                <w:rFonts w:ascii="Times New Roman" w:hAnsi="Times New Roman" w:cs="Times New Roman"/>
+              </w:rPr>
+              <w:t>_création</w:t>
             </w:r>
           </w:p>
         </w:tc>
@@ -1573,7 +1671,7 @@
     </w:p>
     <w:tbl>
       <w:tblPr>
-        <w:tblStyle w:val="ae"/>
+        <w:tblStyle w:val="Grilledutableau"/>
         <w:tblW w:w="0" w:type="auto"/>
         <w:tblLook w:val="04A0" w:firstRow="1" w:lastRow="0" w:firstColumn="1" w:lastColumn="0" w:noHBand="0" w:noVBand="1"/>
       </w:tblPr>
@@ -1799,7 +1897,7 @@
     </w:p>
     <w:tbl>
       <w:tblPr>
-        <w:tblStyle w:val="ae"/>
+        <w:tblStyle w:val="Grilledutableau"/>
         <w:tblW w:w="0" w:type="auto"/>
         <w:tblLook w:val="04A0" w:firstRow="1" w:lastRow="0" w:firstColumn="1" w:lastColumn="0" w:noHBand="0" w:noVBand="1"/>
       </w:tblPr>
@@ -1961,7 +2059,7 @@
     </w:p>
     <w:tbl>
       <w:tblPr>
-        <w:tblStyle w:val="ae"/>
+        <w:tblStyle w:val="Grilledutableau"/>
         <w:tblW w:w="4100" w:type="dxa"/>
         <w:tblLook w:val="04A0" w:firstRow="1" w:lastRow="0" w:firstColumn="1" w:lastColumn="0" w:noHBand="0" w:noVBand="1"/>
       </w:tblPr>
@@ -2139,6 +2237,7 @@
                 <w:rFonts w:ascii="Times New Roman" w:hAnsi="Times New Roman" w:cs="Times New Roman"/>
               </w:rPr>
             </w:pPr>
+            <w:proofErr w:type="gramStart"/>
             <w:r>
               <w:rPr>
                 <w:rFonts w:ascii="Times New Roman" w:hAnsi="Times New Roman" w:cs="Times New Roman"/>
@@ -2151,6 +2250,7 @@
               </w:rPr>
               <w:t>hone</w:t>
             </w:r>
+            <w:proofErr w:type="gramEnd"/>
           </w:p>
         </w:tc>
         <w:tc>
@@ -2227,11 +2327,19 @@
                 <w:rFonts w:ascii="Times New Roman" w:hAnsi="Times New Roman" w:cs="Times New Roman"/>
               </w:rPr>
             </w:pPr>
-            <w:r>
-              <w:rPr>
-                <w:rFonts w:ascii="Times New Roman" w:hAnsi="Times New Roman" w:cs="Times New Roman"/>
-              </w:rPr>
-              <w:t>date_création</w:t>
+            <w:proofErr w:type="gramStart"/>
+            <w:r>
+              <w:rPr>
+                <w:rFonts w:ascii="Times New Roman" w:hAnsi="Times New Roman" w:cs="Times New Roman"/>
+              </w:rPr>
+              <w:t>date</w:t>
+            </w:r>
+            <w:proofErr w:type="gramEnd"/>
+            <w:r>
+              <w:rPr>
+                <w:rFonts w:ascii="Times New Roman" w:hAnsi="Times New Roman" w:cs="Times New Roman"/>
+              </w:rPr>
+              <w:t>_création</w:t>
             </w:r>
           </w:p>
         </w:tc>
@@ -2314,13 +2422,13 @@
         </w:rPr>
         <w:lastRenderedPageBreak/>
         <w:drawing>
-          <wp:anchor distT="0" distB="0" distL="114300" distR="114300" simplePos="0" relativeHeight="251661312" behindDoc="0" locked="0" layoutInCell="1" allowOverlap="1" wp14:anchorId="1A7BC319" wp14:editId="50D97EB4">
+          <wp:anchor distT="0" distB="0" distL="114300" distR="114300" simplePos="0" relativeHeight="251661312" behindDoc="0" locked="0" layoutInCell="1" allowOverlap="1" wp14:anchorId="1A7BC319" wp14:editId="55BC8414">
             <wp:simplePos x="0" y="0"/>
             <wp:positionH relativeFrom="column">
-              <wp:posOffset>-624205</wp:posOffset>
+              <wp:posOffset>-339197</wp:posOffset>
             </wp:positionH>
             <wp:positionV relativeFrom="paragraph">
-              <wp:posOffset>633095</wp:posOffset>
+              <wp:posOffset>775599</wp:posOffset>
             </wp:positionV>
             <wp:extent cx="4787900" cy="3348355"/>
             <wp:effectExtent l="0" t="0" r="0" b="4445"/>
@@ -2409,8 +2517,21 @@
           <w:szCs w:val="40"/>
           <w:lang w:val="en-CA"/>
         </w:rPr>
-        <w:t xml:space="preserve"> d’utilisation</w:t>
-      </w:r>
+        <w:t xml:space="preserve"> </w:t>
+      </w:r>
+      <w:proofErr w:type="spellStart"/>
+      <w:r>
+        <w:rPr>
+          <w:rFonts w:ascii="Times New Roman" w:hAnsi="Times New Roman" w:cs="Times New Roman"/>
+          <w:b/>
+          <w:bCs/>
+          <w:sz w:val="40"/>
+          <w:szCs w:val="40"/>
+          <w:lang w:val="en-CA"/>
+        </w:rPr>
+        <w:t>d’utilisation</w:t>
+      </w:r>
+      <w:proofErr w:type="spellEnd"/>
       <w:r>
         <w:rPr>
           <w:rFonts w:ascii="Times New Roman" w:hAnsi="Times New Roman" w:cs="Times New Roman"/>
@@ -3312,15 +3433,15 @@
     <w:lsdException w:name="Unresolved Mention" w:semiHidden="1" w:unhideWhenUsed="1"/>
     <w:lsdException w:name="Smart Link" w:semiHidden="1" w:unhideWhenUsed="1"/>
   </w:latentStyles>
-  <w:style w:type="paragraph" w:default="1" w:styleId="a">
+  <w:style w:type="paragraph" w:default="1" w:styleId="Normal">
     <w:name w:val="Normal"/>
     <w:qFormat/>
   </w:style>
-  <w:style w:type="paragraph" w:styleId="1">
+  <w:style w:type="paragraph" w:styleId="Titre1">
     <w:name w:val="heading 1"/>
-    <w:basedOn w:val="a"/>
-    <w:next w:val="a"/>
-    <w:link w:val="10"/>
+    <w:basedOn w:val="Normal"/>
+    <w:next w:val="Normal"/>
+    <w:link w:val="Titre1Car"/>
     <w:uiPriority w:val="9"/>
     <w:qFormat/>
     <w:rsid w:val="00564061"/>
@@ -3337,11 +3458,11 @@
       <w:szCs w:val="40"/>
     </w:rPr>
   </w:style>
-  <w:style w:type="paragraph" w:styleId="2">
+  <w:style w:type="paragraph" w:styleId="Titre2">
     <w:name w:val="heading 2"/>
-    <w:basedOn w:val="a"/>
-    <w:next w:val="a"/>
-    <w:link w:val="20"/>
+    <w:basedOn w:val="Normal"/>
+    <w:next w:val="Normal"/>
+    <w:link w:val="Titre2Car"/>
     <w:uiPriority w:val="9"/>
     <w:semiHidden/>
     <w:unhideWhenUsed/>
@@ -3360,11 +3481,11 @@
       <w:szCs w:val="32"/>
     </w:rPr>
   </w:style>
-  <w:style w:type="paragraph" w:styleId="3">
+  <w:style w:type="paragraph" w:styleId="Titre3">
     <w:name w:val="heading 3"/>
-    <w:basedOn w:val="a"/>
-    <w:next w:val="a"/>
-    <w:link w:val="30"/>
+    <w:basedOn w:val="Normal"/>
+    <w:next w:val="Normal"/>
+    <w:link w:val="Titre3Car"/>
     <w:uiPriority w:val="9"/>
     <w:semiHidden/>
     <w:unhideWhenUsed/>
@@ -3383,11 +3504,11 @@
       <w:szCs w:val="28"/>
     </w:rPr>
   </w:style>
-  <w:style w:type="paragraph" w:styleId="4">
+  <w:style w:type="paragraph" w:styleId="Titre4">
     <w:name w:val="heading 4"/>
-    <w:basedOn w:val="a"/>
-    <w:next w:val="a"/>
-    <w:link w:val="40"/>
+    <w:basedOn w:val="Normal"/>
+    <w:next w:val="Normal"/>
+    <w:link w:val="Titre4Car"/>
     <w:uiPriority w:val="9"/>
     <w:semiHidden/>
     <w:unhideWhenUsed/>
@@ -3406,11 +3527,11 @@
       <w:color w:val="0F4761" w:themeColor="accent1" w:themeShade="BF"/>
     </w:rPr>
   </w:style>
-  <w:style w:type="paragraph" w:styleId="5">
+  <w:style w:type="paragraph" w:styleId="Titre5">
     <w:name w:val="heading 5"/>
-    <w:basedOn w:val="a"/>
-    <w:next w:val="a"/>
-    <w:link w:val="50"/>
+    <w:basedOn w:val="Normal"/>
+    <w:next w:val="Normal"/>
+    <w:link w:val="Titre5Car"/>
     <w:uiPriority w:val="9"/>
     <w:semiHidden/>
     <w:unhideWhenUsed/>
@@ -3427,11 +3548,11 @@
       <w:color w:val="0F4761" w:themeColor="accent1" w:themeShade="BF"/>
     </w:rPr>
   </w:style>
-  <w:style w:type="paragraph" w:styleId="6">
+  <w:style w:type="paragraph" w:styleId="Titre6">
     <w:name w:val="heading 6"/>
-    <w:basedOn w:val="a"/>
-    <w:next w:val="a"/>
-    <w:link w:val="60"/>
+    <w:basedOn w:val="Normal"/>
+    <w:next w:val="Normal"/>
+    <w:link w:val="Titre6Car"/>
     <w:uiPriority w:val="9"/>
     <w:semiHidden/>
     <w:unhideWhenUsed/>
@@ -3450,11 +3571,11 @@
       <w:color w:val="595959" w:themeColor="text1" w:themeTint="A6"/>
     </w:rPr>
   </w:style>
-  <w:style w:type="paragraph" w:styleId="7">
+  <w:style w:type="paragraph" w:styleId="Titre7">
     <w:name w:val="heading 7"/>
-    <w:basedOn w:val="a"/>
-    <w:next w:val="a"/>
-    <w:link w:val="70"/>
+    <w:basedOn w:val="Normal"/>
+    <w:next w:val="Normal"/>
+    <w:link w:val="Titre7Car"/>
     <w:uiPriority w:val="9"/>
     <w:semiHidden/>
     <w:unhideWhenUsed/>
@@ -3471,11 +3592,11 @@
       <w:color w:val="595959" w:themeColor="text1" w:themeTint="A6"/>
     </w:rPr>
   </w:style>
-  <w:style w:type="paragraph" w:styleId="8">
+  <w:style w:type="paragraph" w:styleId="Titre8">
     <w:name w:val="heading 8"/>
-    <w:basedOn w:val="a"/>
-    <w:next w:val="a"/>
-    <w:link w:val="80"/>
+    <w:basedOn w:val="Normal"/>
+    <w:next w:val="Normal"/>
+    <w:link w:val="Titre8Car"/>
     <w:uiPriority w:val="9"/>
     <w:semiHidden/>
     <w:unhideWhenUsed/>
@@ -3494,11 +3615,11 @@
       <w:color w:val="272727" w:themeColor="text1" w:themeTint="D8"/>
     </w:rPr>
   </w:style>
-  <w:style w:type="paragraph" w:styleId="9">
+  <w:style w:type="paragraph" w:styleId="Titre9">
     <w:name w:val="heading 9"/>
-    <w:basedOn w:val="a"/>
-    <w:next w:val="a"/>
-    <w:link w:val="90"/>
+    <w:basedOn w:val="Normal"/>
+    <w:next w:val="Normal"/>
+    <w:link w:val="Titre9Car"/>
     <w:uiPriority w:val="9"/>
     <w:semiHidden/>
     <w:unhideWhenUsed/>
@@ -3515,13 +3636,13 @@
       <w:color w:val="272727" w:themeColor="text1" w:themeTint="D8"/>
     </w:rPr>
   </w:style>
-  <w:style w:type="character" w:default="1" w:styleId="a0">
+  <w:style w:type="character" w:default="1" w:styleId="Policepardfaut">
     <w:name w:val="Default Paragraph Font"/>
     <w:uiPriority w:val="1"/>
     <w:semiHidden/>
     <w:unhideWhenUsed/>
   </w:style>
-  <w:style w:type="table" w:default="1" w:styleId="a1">
+  <w:style w:type="table" w:default="1" w:styleId="TableauNormal">
     <w:name w:val="Normal Table"/>
     <w:uiPriority w:val="99"/>
     <w:semiHidden/>
@@ -3536,16 +3657,16 @@
       </w:tblCellMar>
     </w:tblPr>
   </w:style>
-  <w:style w:type="numbering" w:default="1" w:styleId="a2">
+  <w:style w:type="numbering" w:default="1" w:styleId="Aucuneliste">
     <w:name w:val="No List"/>
     <w:uiPriority w:val="99"/>
     <w:semiHidden/>
     <w:unhideWhenUsed/>
   </w:style>
-  <w:style w:type="character" w:customStyle="1" w:styleId="10">
-    <w:name w:val="標題 1 字元"/>
-    <w:basedOn w:val="a0"/>
-    <w:link w:val="1"/>
+  <w:style w:type="character" w:customStyle="1" w:styleId="Titre1Car">
+    <w:name w:val="Titre 1 Car"/>
+    <w:basedOn w:val="Policepardfaut"/>
+    <w:link w:val="Titre1"/>
     <w:uiPriority w:val="9"/>
     <w:rsid w:val="00564061"/>
     <w:rPr>
@@ -3555,10 +3676,10 @@
       <w:szCs w:val="40"/>
     </w:rPr>
   </w:style>
-  <w:style w:type="character" w:customStyle="1" w:styleId="20">
-    <w:name w:val="標題 2 字元"/>
-    <w:basedOn w:val="a0"/>
-    <w:link w:val="2"/>
+  <w:style w:type="character" w:customStyle="1" w:styleId="Titre2Car">
+    <w:name w:val="Titre 2 Car"/>
+    <w:basedOn w:val="Policepardfaut"/>
+    <w:link w:val="Titre2"/>
     <w:uiPriority w:val="9"/>
     <w:semiHidden/>
     <w:rsid w:val="00564061"/>
@@ -3569,10 +3690,10 @@
       <w:szCs w:val="32"/>
     </w:rPr>
   </w:style>
-  <w:style w:type="character" w:customStyle="1" w:styleId="30">
-    <w:name w:val="標題 3 字元"/>
-    <w:basedOn w:val="a0"/>
-    <w:link w:val="3"/>
+  <w:style w:type="character" w:customStyle="1" w:styleId="Titre3Car">
+    <w:name w:val="Titre 3 Car"/>
+    <w:basedOn w:val="Policepardfaut"/>
+    <w:link w:val="Titre3"/>
     <w:uiPriority w:val="9"/>
     <w:semiHidden/>
     <w:rsid w:val="00564061"/>
@@ -3583,10 +3704,10 @@
       <w:szCs w:val="28"/>
     </w:rPr>
   </w:style>
-  <w:style w:type="character" w:customStyle="1" w:styleId="40">
-    <w:name w:val="標題 4 字元"/>
-    <w:basedOn w:val="a0"/>
-    <w:link w:val="4"/>
+  <w:style w:type="character" w:customStyle="1" w:styleId="Titre4Car">
+    <w:name w:val="Titre 4 Car"/>
+    <w:basedOn w:val="Policepardfaut"/>
+    <w:link w:val="Titre4"/>
     <w:uiPriority w:val="9"/>
     <w:semiHidden/>
     <w:rsid w:val="00564061"/>
@@ -3597,10 +3718,10 @@
       <w:color w:val="0F4761" w:themeColor="accent1" w:themeShade="BF"/>
     </w:rPr>
   </w:style>
-  <w:style w:type="character" w:customStyle="1" w:styleId="50">
-    <w:name w:val="標題 5 字元"/>
-    <w:basedOn w:val="a0"/>
-    <w:link w:val="5"/>
+  <w:style w:type="character" w:customStyle="1" w:styleId="Titre5Car">
+    <w:name w:val="Titre 5 Car"/>
+    <w:basedOn w:val="Policepardfaut"/>
+    <w:link w:val="Titre5"/>
     <w:uiPriority w:val="9"/>
     <w:semiHidden/>
     <w:rsid w:val="00564061"/>
@@ -3609,10 +3730,10 @@
       <w:color w:val="0F4761" w:themeColor="accent1" w:themeShade="BF"/>
     </w:rPr>
   </w:style>
-  <w:style w:type="character" w:customStyle="1" w:styleId="60">
-    <w:name w:val="標題 6 字元"/>
-    <w:basedOn w:val="a0"/>
-    <w:link w:val="6"/>
+  <w:style w:type="character" w:customStyle="1" w:styleId="Titre6Car">
+    <w:name w:val="Titre 6 Car"/>
+    <w:basedOn w:val="Policepardfaut"/>
+    <w:link w:val="Titre6"/>
     <w:uiPriority w:val="9"/>
     <w:semiHidden/>
     <w:rsid w:val="00564061"/>
@@ -3623,10 +3744,10 @@
       <w:color w:val="595959" w:themeColor="text1" w:themeTint="A6"/>
     </w:rPr>
   </w:style>
-  <w:style w:type="character" w:customStyle="1" w:styleId="70">
-    <w:name w:val="標題 7 字元"/>
-    <w:basedOn w:val="a0"/>
-    <w:link w:val="7"/>
+  <w:style w:type="character" w:customStyle="1" w:styleId="Titre7Car">
+    <w:name w:val="Titre 7 Car"/>
+    <w:basedOn w:val="Policepardfaut"/>
+    <w:link w:val="Titre7"/>
     <w:uiPriority w:val="9"/>
     <w:semiHidden/>
     <w:rsid w:val="00564061"/>
@@ -3635,10 +3756,10 @@
       <w:color w:val="595959" w:themeColor="text1" w:themeTint="A6"/>
     </w:rPr>
   </w:style>
-  <w:style w:type="character" w:customStyle="1" w:styleId="80">
-    <w:name w:val="標題 8 字元"/>
-    <w:basedOn w:val="a0"/>
-    <w:link w:val="8"/>
+  <w:style w:type="character" w:customStyle="1" w:styleId="Titre8Car">
+    <w:name w:val="Titre 8 Car"/>
+    <w:basedOn w:val="Policepardfaut"/>
+    <w:link w:val="Titre8"/>
     <w:uiPriority w:val="9"/>
     <w:semiHidden/>
     <w:rsid w:val="00564061"/>
@@ -3649,10 +3770,10 @@
       <w:color w:val="272727" w:themeColor="text1" w:themeTint="D8"/>
     </w:rPr>
   </w:style>
-  <w:style w:type="character" w:customStyle="1" w:styleId="90">
-    <w:name w:val="標題 9 字元"/>
-    <w:basedOn w:val="a0"/>
-    <w:link w:val="9"/>
+  <w:style w:type="character" w:customStyle="1" w:styleId="Titre9Car">
+    <w:name w:val="Titre 9 Car"/>
+    <w:basedOn w:val="Policepardfaut"/>
+    <w:link w:val="Titre9"/>
     <w:uiPriority w:val="9"/>
     <w:semiHidden/>
     <w:rsid w:val="00564061"/>
@@ -3661,11 +3782,11 @@
       <w:color w:val="272727" w:themeColor="text1" w:themeTint="D8"/>
     </w:rPr>
   </w:style>
-  <w:style w:type="paragraph" w:styleId="a3">
+  <w:style w:type="paragraph" w:styleId="Titre">
     <w:name w:val="Title"/>
-    <w:basedOn w:val="a"/>
-    <w:next w:val="a"/>
-    <w:link w:val="a4"/>
+    <w:basedOn w:val="Normal"/>
+    <w:next w:val="Normal"/>
+    <w:link w:val="TitreCar"/>
     <w:uiPriority w:val="10"/>
     <w:qFormat/>
     <w:rsid w:val="00564061"/>
@@ -3681,10 +3802,10 @@
       <w:szCs w:val="56"/>
     </w:rPr>
   </w:style>
-  <w:style w:type="character" w:customStyle="1" w:styleId="a4">
-    <w:name w:val="標題 字元"/>
-    <w:basedOn w:val="a0"/>
-    <w:link w:val="a3"/>
+  <w:style w:type="character" w:customStyle="1" w:styleId="TitreCar">
+    <w:name w:val="Titre Car"/>
+    <w:basedOn w:val="Policepardfaut"/>
+    <w:link w:val="Titre"/>
     <w:uiPriority w:val="10"/>
     <w:rsid w:val="00564061"/>
     <w:rPr>
@@ -3695,11 +3816,11 @@
       <w:szCs w:val="56"/>
     </w:rPr>
   </w:style>
-  <w:style w:type="paragraph" w:styleId="a5">
+  <w:style w:type="paragraph" w:styleId="Sous-titre">
     <w:name w:val="Subtitle"/>
-    <w:basedOn w:val="a"/>
-    <w:next w:val="a"/>
-    <w:link w:val="a6"/>
+    <w:basedOn w:val="Normal"/>
+    <w:next w:val="Normal"/>
+    <w:link w:val="Sous-titreCar"/>
     <w:uiPriority w:val="11"/>
     <w:qFormat/>
     <w:rsid w:val="00564061"/>
@@ -3716,10 +3837,10 @@
       <w:szCs w:val="28"/>
     </w:rPr>
   </w:style>
-  <w:style w:type="character" w:customStyle="1" w:styleId="a6">
-    <w:name w:val="副標題 字元"/>
-    <w:basedOn w:val="a0"/>
-    <w:link w:val="a5"/>
+  <w:style w:type="character" w:customStyle="1" w:styleId="Sous-titreCar">
+    <w:name w:val="Sous-titre Car"/>
+    <w:basedOn w:val="Policepardfaut"/>
+    <w:link w:val="Sous-titre"/>
     <w:uiPriority w:val="11"/>
     <w:rsid w:val="00564061"/>
     <w:rPr>
@@ -3730,11 +3851,11 @@
       <w:szCs w:val="28"/>
     </w:rPr>
   </w:style>
-  <w:style w:type="paragraph" w:styleId="a7">
+  <w:style w:type="paragraph" w:styleId="Citation">
     <w:name w:val="Quote"/>
-    <w:basedOn w:val="a"/>
-    <w:next w:val="a"/>
-    <w:link w:val="a8"/>
+    <w:basedOn w:val="Normal"/>
+    <w:next w:val="Normal"/>
+    <w:link w:val="CitationCar"/>
     <w:uiPriority w:val="29"/>
     <w:qFormat/>
     <w:rsid w:val="00564061"/>
@@ -3748,10 +3869,10 @@
       <w:color w:val="404040" w:themeColor="text1" w:themeTint="BF"/>
     </w:rPr>
   </w:style>
-  <w:style w:type="character" w:customStyle="1" w:styleId="a8">
-    <w:name w:val="引文 字元"/>
-    <w:basedOn w:val="a0"/>
-    <w:link w:val="a7"/>
+  <w:style w:type="character" w:customStyle="1" w:styleId="CitationCar">
+    <w:name w:val="Citation Car"/>
+    <w:basedOn w:val="Policepardfaut"/>
+    <w:link w:val="Citation"/>
     <w:uiPriority w:val="29"/>
     <w:rsid w:val="00564061"/>
     <w:rPr>
@@ -3760,9 +3881,9 @@
       <w:color w:val="404040" w:themeColor="text1" w:themeTint="BF"/>
     </w:rPr>
   </w:style>
-  <w:style w:type="paragraph" w:styleId="a9">
+  <w:style w:type="paragraph" w:styleId="Paragraphedeliste">
     <w:name w:val="List Paragraph"/>
-    <w:basedOn w:val="a"/>
+    <w:basedOn w:val="Normal"/>
     <w:uiPriority w:val="34"/>
     <w:qFormat/>
     <w:rsid w:val="00564061"/>
@@ -3771,9 +3892,9 @@
       <w:contextualSpacing/>
     </w:pPr>
   </w:style>
-  <w:style w:type="character" w:styleId="aa">
+  <w:style w:type="character" w:styleId="Accentuationintense">
     <w:name w:val="Intense Emphasis"/>
-    <w:basedOn w:val="a0"/>
+    <w:basedOn w:val="Policepardfaut"/>
     <w:uiPriority w:val="21"/>
     <w:qFormat/>
     <w:rsid w:val="00564061"/>
@@ -3783,11 +3904,11 @@
       <w:color w:val="0F4761" w:themeColor="accent1" w:themeShade="BF"/>
     </w:rPr>
   </w:style>
-  <w:style w:type="paragraph" w:styleId="ab">
+  <w:style w:type="paragraph" w:styleId="Citationintense">
     <w:name w:val="Intense Quote"/>
-    <w:basedOn w:val="a"/>
-    <w:next w:val="a"/>
-    <w:link w:val="ac"/>
+    <w:basedOn w:val="Normal"/>
+    <w:next w:val="Normal"/>
+    <w:link w:val="CitationintenseCar"/>
     <w:uiPriority w:val="30"/>
     <w:qFormat/>
     <w:rsid w:val="00564061"/>
@@ -3806,10 +3927,10 @@
       <w:color w:val="0F4761" w:themeColor="accent1" w:themeShade="BF"/>
     </w:rPr>
   </w:style>
-  <w:style w:type="character" w:customStyle="1" w:styleId="ac">
-    <w:name w:val="鮮明引文 字元"/>
-    <w:basedOn w:val="a0"/>
-    <w:link w:val="ab"/>
+  <w:style w:type="character" w:customStyle="1" w:styleId="CitationintenseCar">
+    <w:name w:val="Citation intense Car"/>
+    <w:basedOn w:val="Policepardfaut"/>
+    <w:link w:val="Citationintense"/>
     <w:uiPriority w:val="30"/>
     <w:rsid w:val="00564061"/>
     <w:rPr>
@@ -3818,9 +3939,9 @@
       <w:color w:val="0F4761" w:themeColor="accent1" w:themeShade="BF"/>
     </w:rPr>
   </w:style>
-  <w:style w:type="character" w:styleId="ad">
+  <w:style w:type="character" w:styleId="Rfrenceintense">
     <w:name w:val="Intense Reference"/>
-    <w:basedOn w:val="a0"/>
+    <w:basedOn w:val="Policepardfaut"/>
     <w:uiPriority w:val="32"/>
     <w:qFormat/>
     <w:rsid w:val="00564061"/>
@@ -3832,9 +3953,9 @@
       <w:spacing w:val="5"/>
     </w:rPr>
   </w:style>
-  <w:style w:type="table" w:styleId="ae">
+  <w:style w:type="table" w:styleId="Grilledutableau">
     <w:name w:val="Table Grid"/>
-    <w:basedOn w:val="a1"/>
+    <w:basedOn w:val="TableauNormal"/>
     <w:uiPriority w:val="39"/>
     <w:rsid w:val="00EB1B16"/>
     <w:pPr>
@@ -3851,10 +3972,10 @@
       </w:tblBorders>
     </w:tblPr>
   </w:style>
-  <w:style w:type="paragraph" w:styleId="af">
+  <w:style w:type="paragraph" w:styleId="En-tte">
     <w:name w:val="header"/>
-    <w:basedOn w:val="a"/>
-    <w:link w:val="af0"/>
+    <w:basedOn w:val="Normal"/>
+    <w:link w:val="En-tteCar"/>
     <w:uiPriority w:val="99"/>
     <w:unhideWhenUsed/>
     <w:rsid w:val="003A21C4"/>
@@ -3870,10 +3991,10 @@
       <w:szCs w:val="20"/>
     </w:rPr>
   </w:style>
-  <w:style w:type="character" w:customStyle="1" w:styleId="af0">
-    <w:name w:val="頁首 字元"/>
-    <w:basedOn w:val="a0"/>
-    <w:link w:val="af"/>
+  <w:style w:type="character" w:customStyle="1" w:styleId="En-tteCar">
+    <w:name w:val="En-tête Car"/>
+    <w:basedOn w:val="Policepardfaut"/>
+    <w:link w:val="En-tte"/>
     <w:uiPriority w:val="99"/>
     <w:rsid w:val="003A21C4"/>
     <w:rPr>
@@ -3881,10 +4002,10 @@
       <w:szCs w:val="20"/>
     </w:rPr>
   </w:style>
-  <w:style w:type="paragraph" w:styleId="af1">
+  <w:style w:type="paragraph" w:styleId="Pieddepage">
     <w:name w:val="footer"/>
-    <w:basedOn w:val="a"/>
-    <w:link w:val="af2"/>
+    <w:basedOn w:val="Normal"/>
+    <w:link w:val="PieddepageCar"/>
     <w:uiPriority w:val="99"/>
     <w:unhideWhenUsed/>
     <w:rsid w:val="003A21C4"/>
@@ -3900,10 +4021,10 @@
       <w:szCs w:val="20"/>
     </w:rPr>
   </w:style>
-  <w:style w:type="character" w:customStyle="1" w:styleId="af2">
-    <w:name w:val="頁尾 字元"/>
-    <w:basedOn w:val="a0"/>
-    <w:link w:val="af1"/>
+  <w:style w:type="character" w:customStyle="1" w:styleId="PieddepageCar">
+    <w:name w:val="Pied de page Car"/>
+    <w:basedOn w:val="Policepardfaut"/>
+    <w:link w:val="Pieddepage"/>
     <w:uiPriority w:val="99"/>
     <w:rsid w:val="003A21C4"/>
     <w:rPr>

</xml_diff>